<commit_message>
Prima bozza AR, aggiunti changelog
Scrittura sezioni iniziali Glossario e modifiche Norme di Progetto
</commit_message>
<xml_diff>
--- a/Glossario/Glossario.docx
+++ b/Glossario/Glossario.docx
@@ -590,7 +590,7 @@
                           </w14:xfrm>
                         </w14:contentPart>
                       </mc:Choice>
-                      <mc:Fallback xmlns:o="urn:schemas-microsoft-com:office:office" xmlns:v="urn:schemas-microsoft-com:vml" xmlns:w10="urn:schemas-microsoft-com:office:word" xmlns:w="http://schemas.openxmlformats.org/wordprocessingml/2006/main" xmlns:lc="http://schemas.openxmlformats.org/drawingml/2006/lockedCanvas" xmlns="">
+                      <mc:Fallback xmlns="" xmlns:lc="http://schemas.openxmlformats.org/drawingml/2006/lockedCanvas" xmlns:w="http://schemas.openxmlformats.org/wordprocessingml/2006/main" xmlns:w10="urn:schemas-microsoft-com:office:word" xmlns:v="urn:schemas-microsoft-com:vml" xmlns:o="urn:schemas-microsoft-com:office:office">
                         <a:pic>
                           <a:nvPicPr>
                             <a:cNvPr id="34" name="Input penna 34"/>
@@ -698,6 +698,370 @@
         </w:rPr>
       </w:pPr>
     </w:p>
+    <w:tbl>
+      <w:tblPr>
+        <w:tblStyle w:val="Tabellasemplice4"/>
+        <w:tblpPr w:leftFromText="141" w:rightFromText="141" w:horzAnchor="margin" w:tblpY="672"/>
+        <w:tblW w:w="9126" w:type="dxa"/>
+        <w:tblLook w:val="0420" w:firstRow="1" w:lastRow="0" w:firstColumn="0" w:lastColumn="0" w:noHBand="0" w:noVBand="1"/>
+      </w:tblPr>
+      <w:tblGrid>
+        <w:gridCol w:w="4563"/>
+        <w:gridCol w:w="4563"/>
+      </w:tblGrid>
+      <w:tr>
+        <w:trPr>
+          <w:cnfStyle w:val="100000000000" w:firstRow="1" w:lastRow="0" w:firstColumn="0" w:lastColumn="0" w:oddVBand="0" w:evenVBand="0" w:oddHBand="0" w:evenHBand="0" w:firstRowFirstColumn="0" w:firstRowLastColumn="0" w:lastRowFirstColumn="0" w:lastRowLastColumn="0"/>
+          <w:trHeight w:val="470"/>
+        </w:trPr>
+        <w:tc>
+          <w:tcPr>
+            <w:tcW w:w="4563" w:type="dxa"/>
+            <w:tcBorders>
+              <w:left w:val="single" w:sz="4" w:space="0" w:color="AD9D95"/>
+            </w:tcBorders>
+            <w:shd w:val="clear" w:color="auto" w:fill="AD9D95"/>
+            <w:vAlign w:val="center"/>
+          </w:tcPr>
+          <w:p>
+            <w:pPr>
+              <w:jc w:val="center"/>
+              <w:rPr>
+                <w:color w:val="FFFFFF" w:themeColor="background1"/>
+                <w:lang w:val="it-IT"/>
+              </w:rPr>
+            </w:pPr>
+            <w:r>
+              <w:rPr>
+                <w:i/>
+                <w:iCs/>
+              </w:rPr>
+              <w:lastRenderedPageBreak/>
+              <w:t>Versione</w:t>
+            </w:r>
+          </w:p>
+        </w:tc>
+        <w:tc>
+          <w:tcPr>
+            <w:tcW w:w="4563" w:type="dxa"/>
+            <w:shd w:val="clear" w:color="auto" w:fill="AD9D95"/>
+            <w:vAlign w:val="center"/>
+          </w:tcPr>
+          <w:p>
+            <w:pPr>
+              <w:jc w:val="center"/>
+              <w:rPr>
+                <w:color w:val="FFFFFF" w:themeColor="background1"/>
+                <w:lang w:val="it-IT"/>
+              </w:rPr>
+            </w:pPr>
+            <w:r>
+              <w:rPr>
+                <w:i/>
+                <w:iCs/>
+              </w:rPr>
+              <w:t>Dettaglio</w:t>
+            </w:r>
+          </w:p>
+        </w:tc>
+      </w:tr>
+      <w:tr>
+        <w:trPr>
+          <w:cnfStyle w:val="000000100000" w:firstRow="0" w:lastRow="0" w:firstColumn="0" w:lastColumn="0" w:oddVBand="0" w:evenVBand="0" w:oddHBand="1" w:evenHBand="0" w:firstRowFirstColumn="0" w:firstRowLastColumn="0" w:lastRowFirstColumn="0" w:lastRowLastColumn="0"/>
+          <w:trHeight w:val="470"/>
+        </w:trPr>
+        <w:tc>
+          <w:tcPr>
+            <w:tcW w:w="4563" w:type="dxa"/>
+            <w:tcBorders>
+              <w:left w:val="single" w:sz="4" w:space="0" w:color="AD9D95"/>
+              <w:right w:val="single" w:sz="4" w:space="0" w:color="AD9D95"/>
+            </w:tcBorders>
+            <w:vAlign w:val="center"/>
+          </w:tcPr>
+          <w:p>
+            <w:pPr>
+              <w:jc w:val="center"/>
+              <w:rPr>
+                <w:lang w:val="it-IT"/>
+              </w:rPr>
+            </w:pPr>
+            <w:r>
+              <w:rPr>
+                <w:lang w:val="it-IT"/>
+              </w:rPr>
+              <w:t>1.0.1</w:t>
+            </w:r>
+          </w:p>
+        </w:tc>
+        <w:tc>
+          <w:tcPr>
+            <w:tcW w:w="4563" w:type="dxa"/>
+            <w:tcBorders>
+              <w:left w:val="single" w:sz="4" w:space="0" w:color="AD9D95"/>
+              <w:right w:val="single" w:sz="4" w:space="0" w:color="AD9D95"/>
+            </w:tcBorders>
+            <w:vAlign w:val="center"/>
+          </w:tcPr>
+          <w:p>
+            <w:pPr>
+              <w:jc w:val="center"/>
+              <w:rPr>
+                <w:lang w:val="it-IT"/>
+              </w:rPr>
+            </w:pPr>
+            <w:r>
+              <w:rPr>
+                <w:lang w:val="it-IT"/>
+              </w:rPr>
+              <w:t>Scrittura Sezione 1 e suddivisione alfabetica documento</w:t>
+            </w:r>
+          </w:p>
+        </w:tc>
+      </w:tr>
+      <w:tr>
+        <w:trPr>
+          <w:trHeight w:val="470"/>
+        </w:trPr>
+        <w:tc>
+          <w:tcPr>
+            <w:tcW w:w="4563" w:type="dxa"/>
+            <w:tcBorders>
+              <w:left w:val="single" w:sz="4" w:space="0" w:color="AD9D95"/>
+              <w:right w:val="single" w:sz="4" w:space="0" w:color="AD9D95"/>
+            </w:tcBorders>
+            <w:vAlign w:val="center"/>
+          </w:tcPr>
+          <w:p>
+            <w:pPr>
+              <w:jc w:val="center"/>
+              <w:rPr>
+                <w:lang w:val="it-IT"/>
+              </w:rPr>
+            </w:pPr>
+          </w:p>
+        </w:tc>
+        <w:tc>
+          <w:tcPr>
+            <w:tcW w:w="4563" w:type="dxa"/>
+            <w:tcBorders>
+              <w:left w:val="single" w:sz="4" w:space="0" w:color="AD9D95"/>
+              <w:right w:val="single" w:sz="4" w:space="0" w:color="AD9D95"/>
+            </w:tcBorders>
+            <w:vAlign w:val="center"/>
+          </w:tcPr>
+          <w:p>
+            <w:pPr>
+              <w:jc w:val="center"/>
+              <w:rPr>
+                <w:lang w:val="it-IT"/>
+              </w:rPr>
+            </w:pPr>
+          </w:p>
+        </w:tc>
+      </w:tr>
+      <w:tr>
+        <w:trPr>
+          <w:cnfStyle w:val="000000100000" w:firstRow="0" w:lastRow="0" w:firstColumn="0" w:lastColumn="0" w:oddVBand="0" w:evenVBand="0" w:oddHBand="1" w:evenHBand="0" w:firstRowFirstColumn="0" w:firstRowLastColumn="0" w:lastRowFirstColumn="0" w:lastRowLastColumn="0"/>
+          <w:trHeight w:val="470"/>
+        </w:trPr>
+        <w:tc>
+          <w:tcPr>
+            <w:tcW w:w="4563" w:type="dxa"/>
+            <w:tcBorders>
+              <w:left w:val="single" w:sz="4" w:space="0" w:color="AD9D95"/>
+              <w:right w:val="single" w:sz="4" w:space="0" w:color="AD9D95"/>
+            </w:tcBorders>
+            <w:vAlign w:val="center"/>
+          </w:tcPr>
+          <w:p>
+            <w:pPr>
+              <w:jc w:val="center"/>
+              <w:rPr>
+                <w:lang w:val="it-IT"/>
+              </w:rPr>
+            </w:pPr>
+          </w:p>
+        </w:tc>
+        <w:tc>
+          <w:tcPr>
+            <w:tcW w:w="4563" w:type="dxa"/>
+            <w:tcBorders>
+              <w:left w:val="single" w:sz="4" w:space="0" w:color="AD9D95"/>
+              <w:right w:val="single" w:sz="4" w:space="0" w:color="AD9D95"/>
+            </w:tcBorders>
+            <w:vAlign w:val="center"/>
+          </w:tcPr>
+          <w:p>
+            <w:pPr>
+              <w:jc w:val="center"/>
+              <w:rPr>
+                <w:lang w:val="it-IT"/>
+              </w:rPr>
+            </w:pPr>
+          </w:p>
+        </w:tc>
+      </w:tr>
+      <w:tr>
+        <w:trPr>
+          <w:trHeight w:val="470"/>
+        </w:trPr>
+        <w:tc>
+          <w:tcPr>
+            <w:tcW w:w="4563" w:type="dxa"/>
+            <w:tcBorders>
+              <w:left w:val="single" w:sz="4" w:space="0" w:color="AD9D95"/>
+              <w:right w:val="single" w:sz="4" w:space="0" w:color="AD9D95"/>
+            </w:tcBorders>
+            <w:vAlign w:val="center"/>
+          </w:tcPr>
+          <w:p>
+            <w:pPr>
+              <w:jc w:val="center"/>
+              <w:rPr>
+                <w:lang w:val="it-IT"/>
+              </w:rPr>
+            </w:pPr>
+          </w:p>
+        </w:tc>
+        <w:tc>
+          <w:tcPr>
+            <w:tcW w:w="4563" w:type="dxa"/>
+            <w:tcBorders>
+              <w:left w:val="single" w:sz="4" w:space="0" w:color="AD9D95"/>
+              <w:right w:val="single" w:sz="4" w:space="0" w:color="AD9D95"/>
+            </w:tcBorders>
+            <w:vAlign w:val="center"/>
+          </w:tcPr>
+          <w:p>
+            <w:pPr>
+              <w:jc w:val="center"/>
+              <w:rPr>
+                <w:lang w:val="it-IT"/>
+              </w:rPr>
+            </w:pPr>
+          </w:p>
+        </w:tc>
+      </w:tr>
+      <w:tr>
+        <w:trPr>
+          <w:cnfStyle w:val="000000100000" w:firstRow="0" w:lastRow="0" w:firstColumn="0" w:lastColumn="0" w:oddVBand="0" w:evenVBand="0" w:oddHBand="1" w:evenHBand="0" w:firstRowFirstColumn="0" w:firstRowLastColumn="0" w:lastRowFirstColumn="0" w:lastRowLastColumn="0"/>
+          <w:trHeight w:val="470"/>
+        </w:trPr>
+        <w:tc>
+          <w:tcPr>
+            <w:tcW w:w="4563" w:type="dxa"/>
+            <w:tcBorders>
+              <w:left w:val="single" w:sz="4" w:space="0" w:color="AD9D95"/>
+              <w:right w:val="single" w:sz="4" w:space="0" w:color="AD9D95"/>
+            </w:tcBorders>
+            <w:vAlign w:val="center"/>
+          </w:tcPr>
+          <w:p>
+            <w:pPr>
+              <w:jc w:val="center"/>
+              <w:rPr>
+                <w:lang w:val="it-IT"/>
+              </w:rPr>
+            </w:pPr>
+          </w:p>
+        </w:tc>
+        <w:tc>
+          <w:tcPr>
+            <w:tcW w:w="4563" w:type="dxa"/>
+            <w:tcBorders>
+              <w:left w:val="single" w:sz="4" w:space="0" w:color="AD9D95"/>
+              <w:right w:val="single" w:sz="4" w:space="0" w:color="AD9D95"/>
+            </w:tcBorders>
+            <w:vAlign w:val="center"/>
+          </w:tcPr>
+          <w:p>
+            <w:pPr>
+              <w:jc w:val="center"/>
+              <w:rPr>
+                <w:lang w:val="it-IT"/>
+              </w:rPr>
+            </w:pPr>
+          </w:p>
+        </w:tc>
+      </w:tr>
+      <w:tr>
+        <w:trPr>
+          <w:trHeight w:val="470"/>
+        </w:trPr>
+        <w:tc>
+          <w:tcPr>
+            <w:tcW w:w="4563" w:type="dxa"/>
+            <w:tcBorders>
+              <w:left w:val="single" w:sz="4" w:space="0" w:color="AD9D95"/>
+              <w:bottom w:val="single" w:sz="4" w:space="0" w:color="AD9D95"/>
+              <w:right w:val="single" w:sz="4" w:space="0" w:color="AD9D95"/>
+            </w:tcBorders>
+            <w:vAlign w:val="center"/>
+          </w:tcPr>
+          <w:p>
+            <w:pPr>
+              <w:jc w:val="center"/>
+              <w:rPr>
+                <w:lang w:val="it-IT"/>
+              </w:rPr>
+            </w:pPr>
+          </w:p>
+        </w:tc>
+        <w:tc>
+          <w:tcPr>
+            <w:tcW w:w="4563" w:type="dxa"/>
+            <w:tcBorders>
+              <w:left w:val="single" w:sz="4" w:space="0" w:color="AD9D95"/>
+              <w:bottom w:val="single" w:sz="4" w:space="0" w:color="AD9D95"/>
+              <w:right w:val="single" w:sz="4" w:space="0" w:color="AD9D95"/>
+            </w:tcBorders>
+            <w:vAlign w:val="center"/>
+          </w:tcPr>
+          <w:p>
+            <w:pPr>
+              <w:jc w:val="center"/>
+              <w:rPr>
+                <w:lang w:val="it-IT"/>
+              </w:rPr>
+            </w:pPr>
+          </w:p>
+        </w:tc>
+      </w:tr>
+    </w:tbl>
+    <w:p>
+      <w:pPr>
+        <w:rPr>
+          <w:sz w:val="32"/>
+          <w:szCs w:val="32"/>
+          <w:lang w:val="it-IT"/>
+        </w:rPr>
+      </w:pPr>
+      <w:r>
+        <w:rPr>
+          <w:sz w:val="32"/>
+          <w:szCs w:val="32"/>
+          <w:lang w:val="it-IT"/>
+        </w:rPr>
+        <w:t>Registro dei Cambiamenti - Changelog</w:t>
+      </w:r>
+      <w:r>
+        <w:rPr>
+          <w:sz w:val="32"/>
+          <w:szCs w:val="32"/>
+          <w:lang w:val="it-IT"/>
+        </w:rPr>
+        <w:t xml:space="preserve"> </w:t>
+      </w:r>
+      <w:r>
+        <w:rPr>
+          <w:sz w:val="32"/>
+          <w:szCs w:val="32"/>
+          <w:lang w:val="it-IT"/>
+        </w:rPr>
+        <w:br w:type="page"/>
+      </w:r>
+    </w:p>
     <w:p>
       <w:pPr>
         <w:spacing w:line="240" w:lineRule="auto"/>
@@ -986,14 +1350,14 @@
         <w:rPr>
           <w:sz w:val="32"/>
           <w:szCs w:val="32"/>
-          <w:lang w:val="it-IT"/>
-        </w:rPr>
-      </w:pPr>
-      <w:r>
-        <w:rPr>
-          <w:sz w:val="32"/>
-          <w:szCs w:val="32"/>
-          <w:lang w:val="it-IT"/>
+          <w:lang w:val="fr-FR"/>
+        </w:rPr>
+      </w:pPr>
+      <w:r>
+        <w:rPr>
+          <w:sz w:val="32"/>
+          <w:szCs w:val="32"/>
+          <w:lang w:val="fr-FR"/>
         </w:rPr>
         <w:t>L</w:t>
       </w:r>
@@ -1004,14 +1368,14 @@
         <w:rPr>
           <w:sz w:val="32"/>
           <w:szCs w:val="32"/>
-          <w:lang w:val="it-IT"/>
-        </w:rPr>
-      </w:pPr>
-      <w:r>
-        <w:rPr>
-          <w:sz w:val="32"/>
-          <w:szCs w:val="32"/>
-          <w:lang w:val="it-IT"/>
+          <w:lang w:val="fr-FR"/>
+        </w:rPr>
+      </w:pPr>
+      <w:r>
+        <w:rPr>
+          <w:sz w:val="32"/>
+          <w:szCs w:val="32"/>
+          <w:lang w:val="fr-FR"/>
         </w:rPr>
         <w:t>M</w:t>
       </w:r>
@@ -1022,14 +1386,14 @@
         <w:rPr>
           <w:sz w:val="32"/>
           <w:szCs w:val="32"/>
-          <w:lang w:val="it-IT"/>
-        </w:rPr>
-      </w:pPr>
-      <w:r>
-        <w:rPr>
-          <w:sz w:val="32"/>
-          <w:szCs w:val="32"/>
-          <w:lang w:val="it-IT"/>
+          <w:lang w:val="fr-FR"/>
+        </w:rPr>
+      </w:pPr>
+      <w:r>
+        <w:rPr>
+          <w:sz w:val="32"/>
+          <w:szCs w:val="32"/>
+          <w:lang w:val="fr-FR"/>
         </w:rPr>
         <w:t>N</w:t>
       </w:r>
@@ -1040,14 +1404,14 @@
         <w:rPr>
           <w:sz w:val="32"/>
           <w:szCs w:val="32"/>
-          <w:lang w:val="it-IT"/>
-        </w:rPr>
-      </w:pPr>
-      <w:r>
-        <w:rPr>
-          <w:sz w:val="32"/>
-          <w:szCs w:val="32"/>
-          <w:lang w:val="it-IT"/>
+          <w:lang w:val="fr-FR"/>
+        </w:rPr>
+      </w:pPr>
+      <w:r>
+        <w:rPr>
+          <w:sz w:val="32"/>
+          <w:szCs w:val="32"/>
+          <w:lang w:val="fr-FR"/>
         </w:rPr>
         <w:t>O</w:t>
       </w:r>
@@ -1058,14 +1422,14 @@
         <w:rPr>
           <w:sz w:val="32"/>
           <w:szCs w:val="32"/>
-          <w:lang w:val="it-IT"/>
-        </w:rPr>
-      </w:pPr>
-      <w:r>
-        <w:rPr>
-          <w:sz w:val="32"/>
-          <w:szCs w:val="32"/>
-          <w:lang w:val="it-IT"/>
+          <w:lang w:val="fr-FR"/>
+        </w:rPr>
+      </w:pPr>
+      <w:r>
+        <w:rPr>
+          <w:sz w:val="32"/>
+          <w:szCs w:val="32"/>
+          <w:lang w:val="fr-FR"/>
         </w:rPr>
         <w:t>P</w:t>
       </w:r>
@@ -1076,14 +1440,14 @@
         <w:rPr>
           <w:sz w:val="32"/>
           <w:szCs w:val="32"/>
-          <w:lang w:val="it-IT"/>
-        </w:rPr>
-      </w:pPr>
-      <w:r>
-        <w:rPr>
-          <w:sz w:val="32"/>
-          <w:szCs w:val="32"/>
-          <w:lang w:val="it-IT"/>
+          <w:lang w:val="fr-FR"/>
+        </w:rPr>
+      </w:pPr>
+      <w:r>
+        <w:rPr>
+          <w:sz w:val="32"/>
+          <w:szCs w:val="32"/>
+          <w:lang w:val="fr-FR"/>
         </w:rPr>
         <w:t>Q</w:t>
       </w:r>
@@ -1094,14 +1458,14 @@
         <w:rPr>
           <w:sz w:val="32"/>
           <w:szCs w:val="32"/>
-          <w:lang w:val="it-IT"/>
-        </w:rPr>
-      </w:pPr>
-      <w:r>
-        <w:rPr>
-          <w:sz w:val="32"/>
-          <w:szCs w:val="32"/>
-          <w:lang w:val="it-IT"/>
+          <w:lang w:val="fr-FR"/>
+        </w:rPr>
+      </w:pPr>
+      <w:r>
+        <w:rPr>
+          <w:sz w:val="32"/>
+          <w:szCs w:val="32"/>
+          <w:lang w:val="fr-FR"/>
         </w:rPr>
         <w:t>R</w:t>
       </w:r>
@@ -1112,14 +1476,14 @@
         <w:rPr>
           <w:sz w:val="32"/>
           <w:szCs w:val="32"/>
-          <w:lang w:val="it-IT"/>
-        </w:rPr>
-      </w:pPr>
-      <w:r>
-        <w:rPr>
-          <w:sz w:val="32"/>
-          <w:szCs w:val="32"/>
-          <w:lang w:val="it-IT"/>
+          <w:lang w:val="fr-FR"/>
+        </w:rPr>
+      </w:pPr>
+      <w:r>
+        <w:rPr>
+          <w:sz w:val="32"/>
+          <w:szCs w:val="32"/>
+          <w:lang w:val="fr-FR"/>
         </w:rPr>
         <w:t>S</w:t>
       </w:r>
@@ -1130,14 +1494,14 @@
         <w:rPr>
           <w:sz w:val="32"/>
           <w:szCs w:val="32"/>
-          <w:lang w:val="it-IT"/>
-        </w:rPr>
-      </w:pPr>
-      <w:r>
-        <w:rPr>
-          <w:sz w:val="32"/>
-          <w:szCs w:val="32"/>
-          <w:lang w:val="it-IT"/>
+          <w:lang w:val="fr-FR"/>
+        </w:rPr>
+      </w:pPr>
+      <w:r>
+        <w:rPr>
+          <w:sz w:val="32"/>
+          <w:szCs w:val="32"/>
+          <w:lang w:val="fr-FR"/>
         </w:rPr>
         <w:t>T</w:t>
       </w:r>
@@ -1148,14 +1512,14 @@
         <w:rPr>
           <w:sz w:val="32"/>
           <w:szCs w:val="32"/>
-          <w:lang w:val="it-IT"/>
-        </w:rPr>
-      </w:pPr>
-      <w:r>
-        <w:rPr>
-          <w:sz w:val="32"/>
-          <w:szCs w:val="32"/>
-          <w:lang w:val="it-IT"/>
+          <w:lang w:val="fr-FR"/>
+        </w:rPr>
+      </w:pPr>
+      <w:r>
+        <w:rPr>
+          <w:sz w:val="32"/>
+          <w:szCs w:val="32"/>
+          <w:lang w:val="fr-FR"/>
         </w:rPr>
         <w:t>U</w:t>
       </w:r>
@@ -1166,14 +1530,14 @@
         <w:rPr>
           <w:sz w:val="32"/>
           <w:szCs w:val="32"/>
-          <w:lang w:val="it-IT"/>
-        </w:rPr>
-      </w:pPr>
-      <w:r>
-        <w:rPr>
-          <w:sz w:val="32"/>
-          <w:szCs w:val="32"/>
-          <w:lang w:val="it-IT"/>
+          <w:lang w:val="fr-FR"/>
+        </w:rPr>
+      </w:pPr>
+      <w:r>
+        <w:rPr>
+          <w:sz w:val="32"/>
+          <w:szCs w:val="32"/>
+          <w:lang w:val="fr-FR"/>
         </w:rPr>
         <w:lastRenderedPageBreak/>
         <w:t>V</w:t>
@@ -1185,14 +1549,14 @@
         <w:rPr>
           <w:sz w:val="32"/>
           <w:szCs w:val="32"/>
-          <w:lang w:val="it-IT"/>
-        </w:rPr>
-      </w:pPr>
-      <w:r>
-        <w:rPr>
-          <w:sz w:val="32"/>
-          <w:szCs w:val="32"/>
-          <w:lang w:val="it-IT"/>
+          <w:lang w:val="fr-FR"/>
+        </w:rPr>
+      </w:pPr>
+      <w:r>
+        <w:rPr>
+          <w:sz w:val="32"/>
+          <w:szCs w:val="32"/>
+          <w:lang w:val="fr-FR"/>
         </w:rPr>
         <w:t>W</w:t>
       </w:r>
@@ -1203,14 +1567,14 @@
         <w:rPr>
           <w:sz w:val="32"/>
           <w:szCs w:val="32"/>
-          <w:lang w:val="it-IT"/>
-        </w:rPr>
-      </w:pPr>
-      <w:r>
-        <w:rPr>
-          <w:sz w:val="32"/>
-          <w:szCs w:val="32"/>
-          <w:lang w:val="it-IT"/>
+          <w:lang w:val="fr-FR"/>
+        </w:rPr>
+      </w:pPr>
+      <w:r>
+        <w:rPr>
+          <w:sz w:val="32"/>
+          <w:szCs w:val="32"/>
+          <w:lang w:val="fr-FR"/>
         </w:rPr>
         <w:t>X</w:t>
       </w:r>
@@ -1221,14 +1585,14 @@
         <w:rPr>
           <w:sz w:val="32"/>
           <w:szCs w:val="32"/>
-          <w:lang w:val="it-IT"/>
-        </w:rPr>
-      </w:pPr>
-      <w:r>
-        <w:rPr>
-          <w:sz w:val="32"/>
-          <w:szCs w:val="32"/>
-          <w:lang w:val="it-IT"/>
+          <w:lang w:val="fr-FR"/>
+        </w:rPr>
+      </w:pPr>
+      <w:r>
+        <w:rPr>
+          <w:sz w:val="32"/>
+          <w:szCs w:val="32"/>
+          <w:lang w:val="fr-FR"/>
         </w:rPr>
         <w:t>Y</w:t>
       </w:r>

</xml_diff>